<commit_message>
Expand final technical report
</commit_message>
<xml_diff>
--- a/code/MP1_Report_3036709171.docx
+++ b/code/MP1_Report_3036709171.docx
@@ -732,6 +732,16 @@
     </w:p>
     <w:p>
       <w:pPr>
+        <w:spacing w:after="60" w:line="252" w:lineRule="auto"/>
+        <w:ind w:firstLine="317"/>
+        <w:jc w:val="both"/>
+      </w:pPr>
+      <w:r>
+        <w:t>These constraints make BPB only one part of the objective. A lower loss is useful only when it is produced by the prescribed causal interface and can be scored within the resource budget. In particular, the evaluator creates fresh windows, so any auxiliary method must derive its prediction from the visible prefix of the current window and from statistics prepared from the training corpus. The implementation therefore treats the Transformer as the main predictor and uses two bounded, causal sources of supplementary evidence.</w:t>
+      </w:r>
+    </w:p>
+    <w:p>
+      <w:pPr>
         <w:pStyle w:val="Heading1"/>
         <w:keepNext/>
         <w:spacing w:before="160" w:after="60"/>
@@ -807,6 +817,16 @@
       </w:pPr>
       <w:r>
         <w:t>Validation calibration assigns weights 0.869656 to the neural model, 0.010261 to bigrams, 0.018828 to trigrams, 0.028403 to 4-grams, and 0.072852 to 5-grams. The neural softmax temperature is 1.15. The mixture weights are global scalars; the checkpoint contains no validation or test token answers.</w:t>
+      </w:r>
+    </w:p>
+    <w:p>
+      <w:pPr>
+        <w:spacing w:after="60" w:line="252" w:lineRule="auto"/>
+        <w:ind w:firstLine="317"/>
+        <w:jc w:val="both"/>
+      </w:pPr>
+      <w:r>
+        <w:t>The n-gram component is most informative when a short lexical continuation has occurred frequently in the training text. It does not replace the neural distribution when the context is unseen: backoff and interpolation leave probability mass with the Transformer. This behaviour is important for a fixed BPE vocabulary, where common word fragments and punctuation patterns are often predictable from a few recent tokens, while rarer contexts need the longer representation learned by attention.</w:t>
       </w:r>
     </w:p>
     <w:p>
@@ -1571,6 +1591,16 @@
     </w:p>
     <w:p>
       <w:pPr>
+        <w:spacing w:after="60" w:line="252" w:lineRule="auto"/>
+        <w:ind w:firstLine="317"/>
+        <w:jc w:val="both"/>
+      </w:pPr>
+      <w:r>
+        <w:t>Search stages were used for distinct decisions rather than as a single uninterrupted run. Continuation and interpolation improved the initial representation; depth expansion then tested whether additional blocks justified their CPU cost. The copy-mixture stages trained the model in the setting in which its final probability distribution would be used. This sequence separates architecture exploration from the later resource-constrained choice of the six-block predictor.</w:t>
+      </w:r>
+    </w:p>
+    <w:p>
+      <w:pPr>
         <w:pStyle w:val="Heading2"/>
         <w:keepNext/>
         <w:spacing w:before="100" w:after="60"/>
@@ -2065,6 +2095,16 @@
       </w:pPr>
       <w:r>
         <w:t>At equal target count, SwiGLU improves validation BPB by 0.060232. The experiment supports the architectural change in the small setting, although the final model operates at a different scale.</w:t>
+      </w:r>
+    </w:p>
+    <w:p>
+      <w:pPr>
+        <w:spacing w:after="60" w:line="252" w:lineRule="auto"/>
+        <w:ind w:firstLine="317"/>
+        <w:jc w:val="both"/>
+      </w:pPr>
+      <w:r>
+        <w:t>The control comparison is intentionally narrow. It holds the data order, seed, training-target count, vocabulary, width, depth, and attention configuration fixed, leaving the feed-forward activation as the material difference. The result therefore provides evidence that the SwiGLU substitution was beneficial before the larger model, additional training, and retrieval components were introduced.</w:t>
       </w:r>
     </w:p>
     <w:p>
@@ -3235,6 +3275,16 @@
     </w:p>
     <w:p>
       <w:pPr>
+        <w:spacing w:after="60" w:line="252" w:lineRule="auto"/>
+        <w:ind w:firstLine="317"/>
+        <w:jc w:val="both"/>
+      </w:pPr>
+      <w:r>
+        <w:t>The identical loss arrays show that timing variation did not alter the prediction path. The spread in elapsed time is instead consistent with ordinary CPU scheduling and memory pressure on the evaluation machine. Reporting the slowest observed ratio is deliberately conservative: it uses the faster bracketing baseline and the slowest candidate run, which gives a direct margin against the five-times requirement.</w:t>
+      </w:r>
+    </w:p>
+    <w:p>
+      <w:pPr>
         <w:pStyle w:val="Heading1"/>
         <w:keepNext/>
         <w:spacing w:before="160" w:after="60"/>
@@ -4360,6 +4410,16 @@
     </w:p>
     <w:p>
       <w:pPr>
+        <w:spacing w:after="60" w:line="252" w:lineRule="auto"/>
+        <w:ind w:firstLine="317"/>
+        <w:jc w:val="both"/>
+      </w:pPr>
+      <w:r>
+        <w:t>The available asset margin is also small: 60.945 MiB leaves only about 3.055 MiB below the 64 MiB cap. Any future attempt to improve the n-gram table or retain deeper weights should first measure the uncompressed bundle, rather than relying on compressed repository size. A stronger follow-up study would repeat the final ablation after depth reduction, profile evaluation on a second CPU, and compare calibration choices under a fixed validation protocol.</w:t>
+      </w:r>
+    </w:p>
+    <w:p>
+      <w:pPr>
         <w:pStyle w:val="Heading1"/>
         <w:keepNext/>
         <w:spacing w:before="160" w:after="60"/>
@@ -4414,30 +4474,7 @@
         <w:jc w:val="both"/>
       </w:pPr>
       <w:r>
-        <w:t>Immutable repository release tag: mp1-v6-report-final-norefs. Expected test BPB: 1.5189136237091485. The checkpoint can be evaluated without retraining.</w:t>
-      </w:r>
-    </w:p>
-    <w:p>
-      <w:pPr>
-        <w:pStyle w:val="Heading1"/>
-        <w:keepNext/>
-        <w:spacing w:before="160" w:after="60"/>
-      </w:pPr>
-      <w:r>
-        <w:rPr>
-          <w:color w:val="000000"/>
-        </w:rPr>
-        <w:t>8 AI Assistance and Reused Work</w:t>
-      </w:r>
-    </w:p>
-    <w:p>
-      <w:pPr>
-        <w:spacing w:after="60" w:line="252" w:lineRule="auto"/>
-        <w:ind w:firstLine="317"/>
-        <w:jc w:val="both"/>
-      </w:pPr>
-      <w:r>
-        <w:t>The supplied baseline implementation, tokenizer, data, trainer, evaluator, and correctness tests were reused from the course package. OpenAI Codex provided substantive assistance with design review, implementation, debugging, experiment scripts, training and calibration runs, resource measurement, compliance checks, documentation, and preparation of this report. Specific assisted work included SwiGLU, depth scaling, checkpoint interpolation, compact n-gram storage, causal prefix caching, copy-mixture training, fast inference, and repeated frozen evaluation. I reviewed the final implementation and remain responsible for understanding the submitted method, results, and limitations.</w:t>
+        <w:t>Immutable repository release tag: mp1-v6-report-expanded. Expected test BPB: 1.5189136237091485. The checkpoint can be evaluated without retraining.</w:t>
       </w:r>
     </w:p>
     <w:sectPr>

</xml_diff>

<commit_message>
Restore AI assistance disclosure
</commit_message>
<xml_diff>
--- a/code/MP1_Report_3036709171.docx
+++ b/code/MP1_Report_3036709171.docx
@@ -4474,7 +4474,30 @@
         <w:jc w:val="both"/>
       </w:pPr>
       <w:r>
-        <w:t>Immutable repository release tag: mp1-v6-report-expanded. Expected test BPB: 1.5189136237091485. The checkpoint can be evaluated without retraining.</w:t>
+        <w:t>Immutable repository release tag: mp1-v6-report-final2. Expected test BPB: 1.5189136237091485. The checkpoint can be evaluated without retraining.</w:t>
+      </w:r>
+    </w:p>
+    <w:p>
+      <w:pPr>
+        <w:pStyle w:val="Heading1"/>
+        <w:keepNext/>
+        <w:spacing w:before="160" w:after="60"/>
+      </w:pPr>
+      <w:r>
+        <w:rPr>
+          <w:color w:val="000000"/>
+        </w:rPr>
+        <w:t>8 AI Assistance and Reused Work</w:t>
+      </w:r>
+    </w:p>
+    <w:p>
+      <w:pPr>
+        <w:spacing w:after="60" w:line="252" w:lineRule="auto"/>
+        <w:ind w:firstLine="317"/>
+        <w:jc w:val="both"/>
+      </w:pPr>
+      <w:r>
+        <w:t>The supplied baseline implementation, tokenizer, data, trainer, evaluator, and correctness tests were reused from the course package. OpenAI Codex provided substantive assistance with design review, implementation, debugging, experiment scripts, training and calibration runs, resource measurement, and compliance checks. Specific assisted work included SwiGLU, depth scaling, checkpoint interpolation, compact n-gram storage, causal prefix caching, copy-mixture training, fast inference, and repeated frozen evaluation. I reviewed the final implementation and remain responsible for understanding the submitted method, results, and limitations.</w:t>
       </w:r>
     </w:p>
     <w:sectPr>

</xml_diff>